<commit_message>
Refresh DDR4 project with filtered assets
</commit_message>
<xml_diff>
--- a/RTDS_test_DDR4_64bit_batch_dev/docs/CPU-FPGA PCIe寄存器表单-软件指导手册.docx
+++ b/RTDS_test_DDR4_64bit_batch_dev/docs/CPU-FPGA PCIe寄存器表单-软件指导手册.docx
@@ -513,8 +513,6 @@
           <w:lang w:val="en-US" w:eastAsia="zh-CN" w:bidi="ar-SA"/>
         </w:rPr>
       </w:pPr>
-      <w:bookmarkStart w:id="1" w:name="_GoBack"/>
-      <w:bookmarkEnd w:id="1"/>
     </w:p>
     <w:p>
       <w:pPr>
@@ -1462,6 +1460,14 @@
         <w:gridCol w:w="1423"/>
       </w:tblGrid>
       <w:tr>
+        <w:tblPrEx>
+          <w:tblCellMar>
+            <w:top w:w="0" w:type="dxa"/>
+            <w:left w:w="108" w:type="dxa"/>
+            <w:bottom w:w="0" w:type="dxa"/>
+            <w:right w:w="108" w:type="dxa"/>
+          </w:tblCellMar>
+        </w:tblPrEx>
         <w:trPr>
           <w:cantSplit/>
           <w:tblHeader/>
@@ -2504,6 +2510,7 @@
       <w:pPr>
         <w:pStyle w:val="16"/>
         <w:numPr>
+          <w:ilvl w:val="0"/>
           <w:numId w:val="0"/>
         </w:numPr>
         <w:ind w:leftChars="0"/>
@@ -2693,51 +2700,23 @@
         </w:rPr>
       </w:pPr>
       <w:r>
-        <w:rPr>
-          <w:rFonts w:ascii="仿宋_GB2312" w:hAnsi="Times New Roman" w:eastAsia="仿宋_GB2312" w:cs="Times New Roman"/>
-          <w:kern w:val="2"/>
-          <w:sz w:val="24"/>
-          <w:szCs w:val="20"/>
-          <w:lang w:eastAsia="zh-CN"/>
-        </w:rPr>
-        <w:drawing>
-          <wp:inline distT="0" distB="0" distL="114300" distR="114300">
-            <wp:extent cx="4085590" cy="3646805"/>
-            <wp:effectExtent l="0" t="0" r="10160" b="10795"/>
-            <wp:docPr id="2" name="Picture 3"/>
-            <wp:cNvGraphicFramePr>
-              <a:graphicFrameLocks xmlns:a="http://schemas.openxmlformats.org/drawingml/2006/main" noChangeAspect="1"/>
-            </wp:cNvGraphicFramePr>
-            <a:graphic xmlns:a="http://schemas.openxmlformats.org/drawingml/2006/main">
-              <a:graphicData uri="http://schemas.openxmlformats.org/drawingml/2006/picture">
-                <pic:pic xmlns:pic="http://schemas.openxmlformats.org/drawingml/2006/picture">
-                  <pic:nvPicPr>
-                    <pic:cNvPr id="2" name="Picture 3"/>
-                    <pic:cNvPicPr>
-                      <a:picLocks noChangeAspect="1"/>
-                    </pic:cNvPicPr>
-                  </pic:nvPicPr>
-                  <pic:blipFill>
-                    <a:blip r:embed="rId7"/>
-                    <a:stretch>
-                      <a:fillRect/>
-                    </a:stretch>
-                  </pic:blipFill>
-                  <pic:spPr>
-                    <a:xfrm>
-                      <a:off x="0" y="0"/>
-                      <a:ext cx="4085590" cy="3646805"/>
-                    </a:xfrm>
-                    <a:prstGeom prst="rect">
-                      <a:avLst/>
-                    </a:prstGeom>
-                  </pic:spPr>
-                </pic:pic>
-              </a:graphicData>
-            </a:graphic>
-          </wp:inline>
-        </w:drawing>
+        <w:object>
+          <v:shape id="_x0000_i1025" o:spt="75" alt="" type="#_x0000_t75" style="height:350.75pt;width:322.7pt;" o:ole="t" filled="f" o:preferrelative="t" stroked="f" coordsize="21600,21600">
+            <v:path/>
+            <v:fill on="f" focussize="0,0"/>
+            <v:stroke on="f"/>
+            <v:imagedata r:id="rId8" o:title=""/>
+            <o:lock v:ext="edit" aspectratio="t"/>
+            <w10:wrap type="none"/>
+            <w10:anchorlock/>
+          </v:shape>
+          <o:OLEObject Type="Embed" ProgID="Visio.Drawing.15" ShapeID="_x0000_i1025" DrawAspect="Content" ObjectID="_1468075725" r:id="rId7">
+            <o:LockedField>false</o:LockedField>
+          </o:OLEObject>
+        </w:object>
       </w:r>
+      <w:bookmarkStart w:id="1" w:name="_GoBack"/>
+      <w:bookmarkEnd w:id="1"/>
     </w:p>
     <w:p>
       <w:pPr>
@@ -2864,6 +2843,7 @@
           </w:tblCellMar>
         </w:tblPrEx>
         <w:trPr>
+          <w:trHeight w:val="90" w:hRule="atLeast"/>
           <w:tblHeader/>
         </w:trPr>
         <w:tc>
@@ -2972,12 +2952,6 @@
             <w:insideH w:val="single" w:color="auto" w:sz="4" w:space="0"/>
             <w:insideV w:val="single" w:color="auto" w:sz="4" w:space="0"/>
           </w:tblBorders>
-          <w:tblCellMar>
-            <w:top w:w="0" w:type="dxa"/>
-            <w:left w:w="108" w:type="dxa"/>
-            <w:bottom w:w="0" w:type="dxa"/>
-            <w:right w:w="108" w:type="dxa"/>
-          </w:tblCellMar>
         </w:tblPrEx>
         <w:tc>
           <w:tcPr>
@@ -3472,12 +3446,6 @@
             <w:insideH w:val="single" w:color="auto" w:sz="4" w:space="0"/>
             <w:insideV w:val="single" w:color="auto" w:sz="4" w:space="0"/>
           </w:tblBorders>
-          <w:tblCellMar>
-            <w:top w:w="0" w:type="dxa"/>
-            <w:left w:w="108" w:type="dxa"/>
-            <w:bottom w:w="0" w:type="dxa"/>
-            <w:right w:w="108" w:type="dxa"/>
-          </w:tblCellMar>
         </w:tblPrEx>
         <w:tc>
           <w:tcPr>
@@ -5194,12 +5162,6 @@
             <w:insideH w:val="single" w:color="auto" w:sz="4" w:space="0"/>
             <w:insideV w:val="single" w:color="auto" w:sz="4" w:space="0"/>
           </w:tblBorders>
-          <w:tblCellMar>
-            <w:top w:w="0" w:type="dxa"/>
-            <w:left w:w="108" w:type="dxa"/>
-            <w:bottom w:w="0" w:type="dxa"/>
-            <w:right w:w="108" w:type="dxa"/>
-          </w:tblCellMar>
         </w:tblPrEx>
         <w:tc>
           <w:tcPr>
@@ -5759,8 +5721,16 @@
     <w:p>
       <w:pPr>
         <w:pStyle w:val="16"/>
+        <w:rPr>
+          <w:sz w:val="22"/>
+          <w:szCs w:val="24"/>
+        </w:rPr>
       </w:pPr>
       <w:r>
+        <w:rPr>
+          <w:sz w:val="22"/>
+          <w:szCs w:val="24"/>
+        </w:rPr>
         <w:t>辅助板将每16Byte组成一帧，经10G Aurora发送到主处理板。</w:t>
       </w:r>
     </w:p>
@@ -5776,6 +5746,7 @@
       <w:pPr>
         <w:pStyle w:val="16"/>
         <w:numPr>
+          <w:ilvl w:val="0"/>
           <w:numId w:val="0"/>
         </w:numPr>
         <w:ind w:leftChars="0"/>
@@ -5873,6 +5844,7 @@
       <w:pPr>
         <w:pStyle w:val="16"/>
         <w:numPr>
+          <w:ilvl w:val="0"/>
           <w:numId w:val="0"/>
         </w:numPr>
         <w:ind w:leftChars="0"/>
@@ -6097,6 +6069,7 @@
       <w:pPr>
         <w:pStyle w:val="14"/>
         <w:numPr>
+          <w:ilvl w:val="0"/>
           <w:numId w:val="0"/>
         </w:numPr>
         <w:ind w:leftChars="0"/>
@@ -6336,6 +6309,7 @@
       <w:pPr>
         <w:pStyle w:val="14"/>
         <w:numPr>
+          <w:ilvl w:val="0"/>
           <w:numId w:val="0"/>
         </w:numPr>
         <w:spacing w:after="80" w:line="300" w:lineRule="auto"/>
@@ -6346,6 +6320,7 @@
       <w:pPr>
         <w:pStyle w:val="14"/>
         <w:numPr>
+          <w:ilvl w:val="0"/>
           <w:numId w:val="0"/>
         </w:numPr>
         <w:spacing w:after="80" w:line="300" w:lineRule="auto"/>
@@ -6356,6 +6331,7 @@
       <w:pPr>
         <w:pStyle w:val="14"/>
         <w:numPr>
+          <w:ilvl w:val="0"/>
           <w:numId w:val="0"/>
         </w:numPr>
         <w:spacing w:after="80" w:line="300" w:lineRule="auto"/>
@@ -6366,6 +6342,7 @@
       <w:pPr>
         <w:pStyle w:val="14"/>
         <w:numPr>
+          <w:ilvl w:val="0"/>
           <w:numId w:val="0"/>
         </w:numPr>
         <w:spacing w:after="80" w:line="300" w:lineRule="auto"/>
@@ -6376,6 +6353,7 @@
       <w:pPr>
         <w:pStyle w:val="14"/>
         <w:numPr>
+          <w:ilvl w:val="0"/>
           <w:numId w:val="0"/>
         </w:numPr>
         <w:spacing w:after="80" w:line="300" w:lineRule="auto"/>
@@ -6386,6 +6364,7 @@
       <w:pPr>
         <w:pStyle w:val="14"/>
         <w:numPr>
+          <w:ilvl w:val="0"/>
           <w:numId w:val="0"/>
         </w:numPr>
         <w:spacing w:after="80" w:line="300" w:lineRule="auto"/>
@@ -6396,6 +6375,7 @@
       <w:pPr>
         <w:pStyle w:val="14"/>
         <w:numPr>
+          <w:ilvl w:val="0"/>
           <w:numId w:val="0"/>
         </w:numPr>
         <w:spacing w:after="80" w:line="300" w:lineRule="auto"/>
@@ -6460,57 +6440,232 @@
     </w:p>
     <w:p>
       <w:pPr>
-        <w:pStyle w:val="16"/>
+        <w:numPr>
+          <w:ilvl w:val="0"/>
+          <w:numId w:val="3"/>
+        </w:numPr>
+        <w:spacing w:after="80" w:line="300" w:lineRule="auto"/>
+        <w:contextualSpacing/>
+        <w:rPr>
+          <w:rFonts w:hint="default" w:ascii="Times New Roman" w:hAnsi="Times New Roman" w:eastAsia="宋体" w:cs="Times New Roman"/>
+          <w:sz w:val="21"/>
+          <w:szCs w:val="22"/>
+          <w:lang w:val="en-US" w:eastAsia="en-US" w:bidi="ar-SA"/>
+        </w:rPr>
       </w:pPr>
       <w:r>
-        <w:t>管理板CPU侧同一时刻只允许一条软件流程处理辅助板上行数据。读取最早待取块的信息、执行C2H和写完成确认必须按顺序完成。</w:t>
+        <w:rPr>
+          <w:rFonts w:hint="default" w:ascii="Times New Roman" w:hAnsi="Times New Roman" w:eastAsia="宋体" w:cs="Times New Roman"/>
+          <w:sz w:val="21"/>
+          <w:szCs w:val="22"/>
+          <w:lang w:val="en-US" w:eastAsia="en-US" w:bidi="ar-SA"/>
+        </w:rPr>
+        <w:t>管理板CPU侧同一时刻只允许一条软件流程处理辅助板上行数据。读取最早待取块的信息、执行C2H</w:t>
+      </w:r>
+      <w:r>
+        <w:rPr>
+          <w:rFonts w:hint="default" w:ascii="Times New Roman" w:hAnsi="Times New Roman" w:eastAsia="宋体" w:cs="Times New Roman"/>
+          <w:sz w:val="21"/>
+          <w:szCs w:val="22"/>
+          <w:lang w:val="en-US" w:eastAsia="zh-CN" w:bidi="ar-SA"/>
+        </w:rPr>
+        <w:t>搬取DDR数据</w:t>
+      </w:r>
+      <w:r>
+        <w:rPr>
+          <w:rFonts w:hint="default" w:ascii="Times New Roman" w:hAnsi="Times New Roman" w:eastAsia="宋体" w:cs="Times New Roman"/>
+          <w:sz w:val="21"/>
+          <w:szCs w:val="22"/>
+          <w:lang w:val="en-US" w:eastAsia="en-US" w:bidi="ar-SA"/>
+        </w:rPr>
+        <w:t>和写完成确认必须按顺序完成。</w:t>
       </w:r>
     </w:p>
     <w:p>
       <w:pPr>
-        <w:pStyle w:val="16"/>
+        <w:numPr>
+          <w:ilvl w:val="0"/>
+          <w:numId w:val="3"/>
+        </w:numPr>
+        <w:spacing w:after="80" w:line="300" w:lineRule="auto"/>
+        <w:contextualSpacing/>
+        <w:rPr>
+          <w:rFonts w:hint="default" w:ascii="Times New Roman" w:hAnsi="Times New Roman" w:eastAsia="宋体" w:cs="Times New Roman"/>
+          <w:sz w:val="21"/>
+          <w:szCs w:val="22"/>
+          <w:lang w:val="en-US" w:eastAsia="en-US" w:bidi="ar-SA"/>
+        </w:rPr>
       </w:pPr>
       <w:r>
-        <w:t>完成C2H DMA前不得写 CPU_REC_STATE，否则DDR块可能被后续数据复用。</w:t>
+        <w:rPr>
+          <w:rFonts w:hint="default" w:ascii="Times New Roman" w:hAnsi="Times New Roman" w:eastAsia="宋体" w:cs="Times New Roman"/>
+          <w:sz w:val="21"/>
+          <w:szCs w:val="22"/>
+          <w:lang w:val="en-US" w:eastAsia="en-US" w:bidi="ar-SA"/>
+        </w:rPr>
+        <w:t>完成上行C2H DMA</w:t>
+      </w:r>
+      <w:r>
+        <w:rPr>
+          <w:rFonts w:hint="eastAsia" w:ascii="Times New Roman" w:hAnsi="Times New Roman" w:eastAsia="宋体" w:cs="Times New Roman"/>
+          <w:sz w:val="21"/>
+          <w:szCs w:val="22"/>
+          <w:lang w:val="en-US" w:eastAsia="zh-CN" w:bidi="ar-SA"/>
+        </w:rPr>
+        <w:t>搬取DDR数据</w:t>
+      </w:r>
+      <w:r>
+        <w:rPr>
+          <w:rFonts w:hint="default" w:ascii="Times New Roman" w:hAnsi="Times New Roman" w:eastAsia="宋体" w:cs="Times New Roman"/>
+          <w:sz w:val="21"/>
+          <w:szCs w:val="22"/>
+          <w:lang w:val="en-US" w:eastAsia="en-US" w:bidi="ar-SA"/>
+        </w:rPr>
+        <w:t>前</w:t>
+      </w:r>
+      <w:r>
+        <w:rPr>
+          <w:rFonts w:hint="eastAsia" w:ascii="Times New Roman" w:hAnsi="Times New Roman" w:eastAsia="宋体" w:cs="Times New Roman"/>
+          <w:sz w:val="21"/>
+          <w:szCs w:val="22"/>
+          <w:lang w:val="en-US" w:eastAsia="zh-CN" w:bidi="ar-SA"/>
+        </w:rPr>
+        <w:t>软件</w:t>
+      </w:r>
+      <w:r>
+        <w:rPr>
+          <w:rFonts w:hint="default" w:ascii="Times New Roman" w:hAnsi="Times New Roman" w:eastAsia="宋体" w:cs="Times New Roman"/>
+          <w:sz w:val="21"/>
+          <w:szCs w:val="22"/>
+          <w:lang w:val="en-US" w:eastAsia="en-US" w:bidi="ar-SA"/>
+        </w:rPr>
+        <w:t>不得写 CPU_REC_STATE，否则DDR块可能被后续数据复用。</w:t>
       </w:r>
     </w:p>
     <w:p>
       <w:pPr>
-        <w:pStyle w:val="16"/>
+        <w:numPr>
+          <w:ilvl w:val="0"/>
+          <w:numId w:val="3"/>
+        </w:numPr>
+        <w:spacing w:after="80" w:line="300" w:lineRule="auto"/>
+        <w:contextualSpacing/>
+        <w:rPr>
+          <w:rFonts w:hint="default" w:ascii="Times New Roman" w:hAnsi="Times New Roman" w:eastAsia="宋体" w:cs="Times New Roman"/>
+          <w:sz w:val="21"/>
+          <w:szCs w:val="22"/>
+          <w:lang w:val="en-US" w:eastAsia="en-US" w:bidi="ar-SA"/>
+        </w:rPr>
       </w:pPr>
       <w:r>
-        <w:t>下行忙期间不得依赖对 0x24/0x28 的写入；RTL会直接忽略这些写操作。</w:t>
+        <w:rPr>
+          <w:rFonts w:hint="default" w:ascii="Times New Roman" w:hAnsi="Times New Roman" w:eastAsia="宋体" w:cs="Times New Roman"/>
+          <w:sz w:val="21"/>
+          <w:szCs w:val="22"/>
+          <w:lang w:val="en-US" w:eastAsia="en-US" w:bidi="ar-SA"/>
+        </w:rPr>
+        <w:t>软件读 0x20：bit0 为 1 表示下行任务仍占用，期间写 0x24（地址）或 0x28（长度）会被</w:t>
+      </w:r>
+      <w:r>
+        <w:rPr>
+          <w:rFonts w:hint="eastAsia" w:ascii="Times New Roman" w:hAnsi="Times New Roman" w:eastAsia="宋体" w:cs="Times New Roman"/>
+          <w:sz w:val="21"/>
+          <w:szCs w:val="22"/>
+          <w:lang w:val="en-US" w:eastAsia="zh-CN" w:bidi="ar-SA"/>
+        </w:rPr>
+        <w:t>FPGA</w:t>
+      </w:r>
+      <w:r>
+        <w:rPr>
+          <w:rFonts w:hint="default" w:ascii="Times New Roman" w:hAnsi="Times New Roman" w:eastAsia="宋体" w:cs="Times New Roman"/>
+          <w:sz w:val="21"/>
+          <w:szCs w:val="22"/>
+          <w:lang w:val="en-US" w:eastAsia="en-US" w:bidi="ar-SA"/>
+        </w:rPr>
+        <w:t>忽略；bit0 为 0 时才配置这两个寄存器，再向 0x20 写 1 提交</w:t>
+      </w:r>
+      <w:r>
+        <w:rPr>
+          <w:rFonts w:hint="eastAsia" w:ascii="Times New Roman" w:hAnsi="Times New Roman" w:eastAsia="宋体" w:cs="Times New Roman"/>
+          <w:sz w:val="21"/>
+          <w:szCs w:val="22"/>
+          <w:lang w:val="en-US" w:eastAsia="zh-CN" w:bidi="ar-SA"/>
+        </w:rPr>
+        <w:t>。</w:t>
       </w:r>
     </w:p>
     <w:p>
       <w:pPr>
-        <w:pStyle w:val="16"/>
+        <w:numPr>
+          <w:ilvl w:val="0"/>
+          <w:numId w:val="3"/>
+        </w:numPr>
+        <w:spacing w:after="80" w:line="300" w:lineRule="auto"/>
+        <w:contextualSpacing/>
+        <w:rPr>
+          <w:rFonts w:hint="default" w:ascii="Times New Roman" w:hAnsi="Times New Roman" w:eastAsia="宋体" w:cs="Times New Roman"/>
+          <w:sz w:val="21"/>
+          <w:szCs w:val="22"/>
+          <w:lang w:val="en-US" w:eastAsia="en-US" w:bidi="ar-SA"/>
+        </w:rPr>
       </w:pPr>
       <w:r>
+        <w:rPr>
+          <w:rFonts w:hint="default" w:ascii="Times New Roman" w:hAnsi="Times New Roman" w:eastAsia="宋体" w:cs="Times New Roman"/>
+          <w:sz w:val="21"/>
+          <w:szCs w:val="22"/>
+          <w:lang w:val="en-US" w:eastAsia="en-US" w:bidi="ar-SA"/>
+        </w:rPr>
         <w:t>下行必须先完成H2C数据写入，再向 CPU_WR_DONE.bit0写1启动任务。</w:t>
       </w:r>
     </w:p>
     <w:p>
       <w:pPr>
-        <w:pStyle w:val="16"/>
+        <w:numPr>
+          <w:ilvl w:val="0"/>
+          <w:numId w:val="3"/>
+        </w:numPr>
+        <w:spacing w:after="80" w:line="300" w:lineRule="auto"/>
+        <w:contextualSpacing/>
+        <w:rPr>
+          <w:rFonts w:hint="default" w:ascii="Times New Roman" w:hAnsi="Times New Roman" w:eastAsia="宋体" w:cs="Times New Roman"/>
+          <w:sz w:val="21"/>
+          <w:szCs w:val="22"/>
+          <w:lang w:val="en-US" w:eastAsia="en-US" w:bidi="ar-SA"/>
+        </w:rPr>
       </w:pPr>
       <w:r>
+        <w:rPr>
+          <w:rFonts w:hint="default" w:ascii="Times New Roman" w:hAnsi="Times New Roman" w:eastAsia="宋体" w:cs="Times New Roman"/>
+          <w:sz w:val="21"/>
+          <w:szCs w:val="22"/>
+          <w:lang w:val="en-US" w:eastAsia="en-US" w:bidi="ar-SA"/>
+        </w:rPr>
         <w:t>UP_DROP_WORD_CNT统计单位是32bit字，不是Aurora帧；计数饱和后保持 0xFFFFFFFF。</w:t>
       </w:r>
     </w:p>
     <w:p>
       <w:pPr>
-        <w:pStyle w:val="16"/>
+        <w:numPr>
+          <w:ilvl w:val="0"/>
+          <w:numId w:val="3"/>
+        </w:numPr>
+        <w:spacing w:after="80" w:line="300" w:lineRule="auto"/>
+        <w:contextualSpacing/>
+        <w:rPr>
+          <w:rFonts w:hint="default" w:ascii="Times New Roman" w:hAnsi="Times New Roman" w:eastAsia="宋体" w:cs="Times New Roman"/>
+          <w:sz w:val="21"/>
+          <w:szCs w:val="22"/>
+          <w:lang w:val="en-US" w:eastAsia="en-US" w:bidi="ar-SA"/>
+        </w:rPr>
       </w:pPr>
       <w:r>
-        <w:t>软件发现丢字计数增加时，只能确定发生过数据丢失，不能从DDR连续数组中定位具体缺口。</w:t>
-      </w:r>
-    </w:p>
-    <w:p>
-      <w:pPr>
-        <w:pStyle w:val="16"/>
-      </w:pPr>
-      <w:r>
+        <w:rPr>
+          <w:rFonts w:hint="default" w:ascii="Times New Roman" w:hAnsi="Times New Roman" w:eastAsia="宋体" w:cs="Times New Roman"/>
+          <w:sz w:val="21"/>
+          <w:szCs w:val="22"/>
+          <w:lang w:val="en-US" w:eastAsia="en-US" w:bidi="ar-SA"/>
+        </w:rPr>
         <w:t>DMA完成与MMIO控制寄存器写入之间必须使用操作系统或驱动提供的内存顺序保证。</w:t>
       </w:r>
     </w:p>
@@ -6820,7 +6975,7 @@
     <w:lsdException w:qFormat="1" w:uiPriority="99" w:semiHidden="0" w:name="List Bullet"/>
     <w:lsdException w:qFormat="1" w:uiPriority="99" w:semiHidden="0" w:name="List Number"/>
     <w:lsdException w:qFormat="1" w:uiPriority="99" w:semiHidden="0" w:name="List 2"/>
-    <w:lsdException w:uiPriority="99" w:semiHidden="0" w:name="List 3"/>
+    <w:lsdException w:qFormat="1" w:uiPriority="99" w:semiHidden="0" w:name="List 3"/>
     <w:lsdException w:uiPriority="99" w:name="List 4"/>
     <w:lsdException w:uiPriority="99" w:name="List 5"/>
     <w:lsdException w:qFormat="1" w:uiPriority="99" w:semiHidden="0" w:name="List Bullet 2"/>
@@ -7326,6 +7481,7 @@
     <w:name w:val="List 3"/>
     <w:basedOn w:val="1"/>
     <w:unhideWhenUsed/>
+    <w:qFormat/>
     <w:uiPriority w:val="99"/>
     <w:pPr>
       <w:ind w:left="1080" w:hanging="360"/>

</xml_diff>